<commit_message>
Generated docs regenerated for the v1.11.170 arc (spec, training, walkthrough)
Content frozen at .154/.155 caught up: 20 modules (Teams row + admin
sections, module-map diagram rebuilt 14->20), SQL two-engine story,
real OrganizationType enum in the env-badge sections (Customer/
Secondary = prod, fail-closed) incl. the FAQ row, Show All Data lookup
editing, Virtual/Elastic chips, ERD N:N edges + business-first graph,
cache self-eviction, history privacy + PROD confirmations in security,
render caps in performance, stats (20.6k LOC / 73 actions / 39
components / 314 tests), log buffer 300. gen-security.js untouched
(dated June 2026 audit report - historical).

Co-Authored-By: Claude Fable 5 <noreply@anthropic.com>
</commit_message>
<xml_diff>
--- a/docs/Colvio_Guide_Formation.docx
+++ b/docs/Colvio_Guide_Formation.docx
@@ -63,7 +63,7 @@
           <w:sz w:val="22"/>
           <w:szCs w:val="22"/>
         </w:rPr>
-        <w:t xml:space="preserve">v1.11.154  ·  Août 2026</w:t>
+        <w:t xml:space="preserve">v1.11.170  ·  Octobre 2026</w:t>
       </w:r>
     </w:p>
     <w:p>
@@ -199,10 +199,10 @@
           <w:b/>
           <w:bCs/>
         </w:rPr>
-        <w:t xml:space="preserve">14 modules</w:t>
-      </w:r>
-      <w:r>
-        <w:t xml:space="preserve"> couvrant l'exploration, la restauration, le chargement de données, le test d'API et l'audit.</w:t>
+        <w:t xml:space="preserve">20 modules</w:t>
+      </w:r>
+      <w:r>
+        <w:t xml:space="preserve"> couvrant l'exploration, la restauration, le chargement de données, le test d'API, la modélisation et l'audit.</w:t>
       </w:r>
     </w:p>
     <w:p>
@@ -288,7 +288,7 @@
           <w:sz w:val="20"/>
           <w:szCs w:val="20"/>
         </w:rPr>
-        <w:t xml:space="preserve">💡 Capture d'écran recommandée ici : la barre latérale Colvio avec les 19 onglets, sur votre org de démo.</w:t>
+        <w:t xml:space="preserve">💡 Capture d'écran recommandée ici : la barre latérale Colvio avec les 20 onglets, sur votre org de démo.</w:t>
       </w:r>
     </w:p>
     <w:p>
@@ -435,50 +435,20 @@
           <w:b/>
           <w:bCs/>
         </w:rPr>
-        <w:t xml:space="preserve">PROD</w:t>
-      </w:r>
-      <w:r>
-        <w:t xml:space="preserve">, </w:t>
-      </w:r>
-      <w:r>
-        <w:rPr>
-          <w:b/>
-          <w:bCs/>
-        </w:rPr>
-        <w:t xml:space="preserve">SANDBOX</w:t>
-      </w:r>
-      <w:r>
-        <w:t xml:space="preserve">, </w:t>
-      </w:r>
-      <w:r>
-        <w:rPr>
-          <w:b/>
-          <w:bCs/>
-        </w:rPr>
-        <w:t xml:space="preserve">UAT</w:t>
-      </w:r>
-      <w:r>
-        <w:t xml:space="preserve">, </w:t>
-      </w:r>
-      <w:r>
-        <w:rPr>
-          <w:b/>
-          <w:bCs/>
-        </w:rPr>
-        <w:t xml:space="preserve">DEV</w:t>
-      </w:r>
-      <w:r>
-        <w:t xml:space="preserve">, </w:t>
-      </w:r>
-      <w:r>
-        <w:rPr>
-          <w:b/>
-          <w:bCs/>
-        </w:rPr>
-        <w:t xml:space="preserve">TRIAL</w:t>
-      </w:r>
-      <w:r>
-        <w:t xml:space="preserve">… Il provient de l'API </w:t>
+        <w:t xml:space="preserve">⚠ PROD</w:t>
+      </w:r>
+      <w:r>
+        <w:t xml:space="preserve"> (rouge) ou </w:t>
+      </w:r>
+      <w:r>
+        <w:rPr>
+          <w:b/>
+          <w:bCs/>
+        </w:rPr>
+        <w:t xml:space="preserve">SANDBOX / UAT / DEV / TRIAL</w:t>
+      </w:r>
+      <w:r>
+        <w:t xml:space="preserve"> (vert). Il est mappé sur l'enum OrganizationType DOCUMENTÉ de Microsoft : une org de production répond </w:t>
       </w:r>
       <w:r>
         <w:rPr>
@@ -487,10 +457,22 @@
           <w:sz w:val="19"/>
           <w:szCs w:val="19"/>
         </w:rPr>
-        <w:t xml:space="preserve">RetrieveCurrentOrganization</w:t>
-      </w:r>
-      <w:r>
-        <w:t xml:space="preserve"> de Microsoft (champ OrganizationType) — la source la plus fiable — avec une heuristique d'URL en simple secours. Vérifiez-le toujours avant un chargement de données.</w:t>
+        <w:t xml:space="preserve">Customer</w:t>
+      </w:r>
+      <w:r>
+        <w:t xml:space="preserve"> ou </w:t>
+      </w:r>
+      <w:r>
+        <w:rPr>
+          <w:rFonts w:ascii="Consolas" w:cs="Consolas" w:eastAsia="Consolas" w:hAnsi="Consolas"/>
+          <w:color w:val="0E7490"/>
+          <w:sz w:val="19"/>
+          <w:szCs w:val="19"/>
+        </w:rPr>
+        <w:t xml:space="preserve">Secondary</w:t>
+      </w:r>
+      <w:r>
+        <w:t xml:space="preserve"> — l'enum n'a pas de membre « Production » — et toute valeur inconnue est présumée production (fail-closed). Les confirmations PROD de Colvio (Loader, update/delete en masse, éditions) s'arment sur cette détection. Vérifiez toujours le badge avant un chargement.</w:t>
       </w:r>
     </w:p>
     <w:p>
@@ -807,7 +789,17 @@
         <w:spacing w:after="120"/>
       </w:pPr>
       <w:r>
-        <w:t xml:space="preserve">Écrivez </w:t>
+        <w:t xml:space="preserve">Deux moteurs, un toggle. </w:t>
+      </w:r>
+      <w:r>
+        <w:rPr>
+          <w:b/>
+          <w:bCs/>
+        </w:rPr>
+        <w:t xml:space="preserve">⚡ Natif</w:t>
+      </w:r>
+      <w:r>
+        <w:t xml:space="preserve"> (défaut) : votre SELECT part tel quel à Dataverse via l'option Web API </w:t>
       </w:r>
       <w:r>
         <w:rPr>
@@ -816,166 +808,20 @@
           <w:sz w:val="19"/>
           <w:szCs w:val="19"/>
         </w:rPr>
-        <w:t xml:space="preserve">SELECT</w:t>
-      </w:r>
-      <w:r>
-        <w:t xml:space="preserve">, </w:t>
-      </w:r>
-      <w:r>
-        <w:rPr>
-          <w:rFonts w:ascii="Consolas" w:cs="Consolas" w:eastAsia="Consolas" w:hAnsi="Consolas"/>
-          <w:color w:val="0E7490"/>
-          <w:sz w:val="19"/>
-          <w:szCs w:val="19"/>
-        </w:rPr>
-        <w:t xml:space="preserve">FROM</w:t>
-      </w:r>
-      <w:r>
-        <w:t xml:space="preserve">, </w:t>
-      </w:r>
-      <w:r>
-        <w:rPr>
-          <w:rFonts w:ascii="Consolas" w:cs="Consolas" w:eastAsia="Consolas" w:hAnsi="Consolas"/>
-          <w:color w:val="0E7490"/>
-          <w:sz w:val="19"/>
-          <w:szCs w:val="19"/>
-        </w:rPr>
-        <w:t xml:space="preserve">JOIN</w:t>
-      </w:r>
-      <w:r>
-        <w:t xml:space="preserve">, </w:t>
-      </w:r>
-      <w:r>
-        <w:rPr>
-          <w:rFonts w:ascii="Consolas" w:cs="Consolas" w:eastAsia="Consolas" w:hAnsi="Consolas"/>
-          <w:color w:val="0E7490"/>
-          <w:sz w:val="19"/>
-          <w:szCs w:val="19"/>
-        </w:rPr>
-        <w:t xml:space="preserve">WHERE</w:t>
-      </w:r>
-      <w:r>
-        <w:t xml:space="preserve">, </w:t>
-      </w:r>
-      <w:r>
-        <w:rPr>
-          <w:rFonts w:ascii="Consolas" w:cs="Consolas" w:eastAsia="Consolas" w:hAnsi="Consolas"/>
-          <w:color w:val="0E7490"/>
-          <w:sz w:val="19"/>
-          <w:szCs w:val="19"/>
-        </w:rPr>
-        <w:t xml:space="preserve">ORDER BY</w:t>
-      </w:r>
-      <w:r>
-        <w:t xml:space="preserve">, </w:t>
-      </w:r>
-      <w:r>
-        <w:rPr>
-          <w:rFonts w:ascii="Consolas" w:cs="Consolas" w:eastAsia="Consolas" w:hAnsi="Consolas"/>
-          <w:color w:val="0E7490"/>
-          <w:sz w:val="19"/>
-          <w:szCs w:val="19"/>
-        </w:rPr>
-        <w:t xml:space="preserve">TOP</w:t>
-      </w:r>
-      <w:r>
-        <w:t xml:space="preserve">, </w:t>
-      </w:r>
-      <w:r>
-        <w:rPr>
-          <w:rFonts w:ascii="Consolas" w:cs="Consolas" w:eastAsia="Consolas" w:hAnsi="Consolas"/>
-          <w:color w:val="0E7490"/>
-          <w:sz w:val="19"/>
-          <w:szCs w:val="19"/>
-        </w:rPr>
-        <w:t xml:space="preserve">DISTINCT</w:t>
-      </w:r>
-      <w:r>
-        <w:t xml:space="preserve">, </w:t>
-      </w:r>
-      <w:r>
-        <w:rPr>
-          <w:rFonts w:ascii="Consolas" w:cs="Consolas" w:eastAsia="Consolas" w:hAnsi="Consolas"/>
-          <w:color w:val="0E7490"/>
-          <w:sz w:val="19"/>
-          <w:szCs w:val="19"/>
-        </w:rPr>
-        <w:t xml:space="preserve">GROUP BY</w:t>
-      </w:r>
-      <w:r>
-        <w:t xml:space="preserve"> et les agrégats (</w:t>
-      </w:r>
-      <w:r>
-        <w:rPr>
-          <w:rFonts w:ascii="Consolas" w:cs="Consolas" w:eastAsia="Consolas" w:hAnsi="Consolas"/>
-          <w:color w:val="0E7490"/>
-          <w:sz w:val="19"/>
-          <w:szCs w:val="19"/>
-        </w:rPr>
-        <w:t xml:space="preserve">COUNT(*)</w:t>
-      </w:r>
-      <w:r>
-        <w:t xml:space="preserve">, </w:t>
-      </w:r>
-      <w:r>
-        <w:rPr>
-          <w:rFonts w:ascii="Consolas" w:cs="Consolas" w:eastAsia="Consolas" w:hAnsi="Consolas"/>
-          <w:color w:val="0E7490"/>
-          <w:sz w:val="19"/>
-          <w:szCs w:val="19"/>
-        </w:rPr>
-        <w:t xml:space="preserve">SUM</w:t>
-      </w:r>
-      <w:r>
-        <w:t xml:space="preserve">, </w:t>
-      </w:r>
-      <w:r>
-        <w:rPr>
-          <w:rFonts w:ascii="Consolas" w:cs="Consolas" w:eastAsia="Consolas" w:hAnsi="Consolas"/>
-          <w:color w:val="0E7490"/>
-          <w:sz w:val="19"/>
-          <w:szCs w:val="19"/>
-        </w:rPr>
-        <w:t xml:space="preserve">AVG</w:t>
-      </w:r>
-      <w:r>
-        <w:t xml:space="preserve">, </w:t>
-      </w:r>
-      <w:r>
-        <w:rPr>
-          <w:rFonts w:ascii="Consolas" w:cs="Consolas" w:eastAsia="Consolas" w:hAnsi="Consolas"/>
-          <w:color w:val="0E7490"/>
-          <w:sz w:val="19"/>
-          <w:szCs w:val="19"/>
-        </w:rPr>
-        <w:t xml:space="preserve">MIN</w:t>
-      </w:r>
-      <w:r>
-        <w:t xml:space="preserve">, </w:t>
-      </w:r>
-      <w:r>
-        <w:rPr>
-          <w:rFonts w:ascii="Consolas" w:cs="Consolas" w:eastAsia="Consolas" w:hAnsi="Consolas"/>
-          <w:color w:val="0E7490"/>
-          <w:sz w:val="19"/>
-          <w:szCs w:val="19"/>
-        </w:rPr>
-        <w:t xml:space="preserve">MAX</w:t>
-      </w:r>
-      <w:r>
-        <w:t xml:space="preserve">). La traduction en FetchXML garantit une pagination fiable et des jointures via </w:t>
-      </w:r>
-      <w:r>
-        <w:rPr>
-          <w:rFonts w:ascii="Consolas" w:cs="Consolas" w:eastAsia="Consolas" w:hAnsi="Consolas"/>
-          <w:color w:val="0E7490"/>
-          <w:sz w:val="19"/>
-          <w:szCs w:val="19"/>
-        </w:rPr>
-        <w:t xml:space="preserve">link-entity</w:t>
-      </w:r>
-      <w:r>
-        <w:t xml:space="preserve"> :</w:t>
+        <w:t xml:space="preserve">?sql=</w:t>
+      </w:r>
+      <w:r>
+        <w:t xml:space="preserve"> — le serveur le parse : JOIN multi-tables avec alias, self-joins, DISTINCT, GROUP BY et agrégats côté serveur, dates relatives DATEADD/GETUTCDATE (pas de SELECT *, sous-requêtes, HAVING ni TOP ; agrégats plafonnés à 50 000). </w:t>
+      </w:r>
+      <w:r>
+        <w:rPr>
+          <w:b/>
+          <w:bCs/>
+        </w:rPr>
+        <w:t xml:space="preserve">⇄ Transpilé</w:t>
+      </w:r>
+      <w:r>
+        <w:t xml:space="preserve"> : Colvio traduit le SQL en FetchXML — seul moteur avec HAVING et TOP, et bascule automatique si l'org n'a pas encore l'option :</w:t>
       </w:r>
     </w:p>
     <w:p>
@@ -1329,7 +1175,17 @@
         <w:t xml:space="preserve">tous ses champs</w:t>
       </w:r>
       <w:r>
-        <w:t xml:space="preserve"> : nom logique, libellé, type, valeur. Lookups cliquables, copie champ par champ ou JSON complet.</w:t>
+        <w:t xml:space="preserve"> : nom logique, libellé, type, valeur. Lookups cliquables, copie champ par champ ou JSON complet. Les champs modifiables s'éditent inline — </w:t>
+      </w:r>
+      <w:r>
+        <w:rPr>
+          <w:b/>
+          <w:bCs/>
+        </w:rPr>
+        <w:t xml:space="preserve">lookups inclus</w:t>
+      </w:r>
+      <w:r>
+        <w:t xml:space="preserve"> : collez le GUID cible pour lier/relier, videz pour effacer, le tout validé avant envoi (confirmation en production).</w:t>
       </w:r>
     </w:p>
     <w:p>
@@ -1365,7 +1221,17 @@
         <w:t xml:space="preserve">export de tous les OptionSets</w:t>
       </w:r>
       <w:r>
-        <w:t xml:space="preserve">. C'est ici que vous vérifiez les libellés exacts d'une picklist avant un import par labels.</w:t>
+        <w:t xml:space="preserve">. Des </w:t>
+      </w:r>
+      <w:r>
+        <w:rPr>
+          <w:b/>
+          <w:bCs/>
+        </w:rPr>
+        <w:t xml:space="preserve">chips Virtual / Elastic</w:t>
+      </w:r>
+      <w:r>
+        <w:t xml:space="preserve"> filtrent par type de table (retrouvez toutes vos tables virtuelles d'un coup d'œil). C'est ici que vous vérifiez les libellés exacts d'une picklist avant un import par labels.</w:t>
       </w:r>
     </w:p>
     <w:p>
@@ -2866,7 +2732,17 @@
         <w:spacing w:after="120"/>
       </w:pPr>
       <w:r>
-        <w:t xml:space="preserve">Diagramme Entité-Relation interactif : ajoutez des entités au canevas, les cartes montrent les champs avec badges FK, des courbes relient chaque lookup à sa cible. Glissez, zoomez, « + » ajoute les entités liées. Export </w:t>
+        <w:t xml:space="preserve">Diagramme Entité-Relation interactif : ajoutez des entités au canevas, les cartes montrent les champs avec badges FK, des courbes relient chaque lookup à sa cible. Les relations </w:t>
+      </w:r>
+      <w:r>
+        <w:rPr>
+          <w:b/>
+          <w:bCs/>
+        </w:rPr>
+        <w:t xml:space="preserve">N:N</w:t>
+      </w:r>
+      <w:r>
+        <w:t xml:space="preserve"> se dessinent en pointillés entre les cartes. Glissez, zoomez, « + » ajoute les entités liées. Export </w:t>
       </w:r>
       <w:r>
         <w:rPr>
@@ -2876,7 +2752,7 @@
         <w:t xml:space="preserve">PNG, SVG, Mermaid</w:t>
       </w:r>
       <w:r>
-        <w:t xml:space="preserve">.</w:t>
+        <w:t xml:space="preserve"> — votre data model, prêt pour un wiki ou un deck.</w:t>
       </w:r>
     </w:p>
     <w:p>
@@ -2892,7 +2768,17 @@
         <w:spacing w:after="120"/>
       </w:pPr>
       <w:r>
-        <w:t xml:space="preserve">Graphe des relations d'une entité : parents N:1, enfants 1:N, N:N. Profondeur 1-2, clic pour naviguer.</w:t>
+        <w:t xml:space="preserve">Graphe des relations d'une entité : parents N:1, enfants 1:N, N:N. Les relations </w:t>
+      </w:r>
+      <w:r>
+        <w:rPr>
+          <w:b/>
+          <w:bCs/>
+        </w:rPr>
+        <w:t xml:space="preserve">métier</w:t>
+      </w:r>
+      <w:r>
+        <w:t xml:space="preserve"> s'affichent d'abord ; la plomberie système (createdby, owner, devise…) est masquée derrière un toggle. ↻ recharge depuis l'org (les métadonnées sont cachées 1 h). Profondeur 1-2, clic pour naviguer.</w:t>
       </w:r>
     </w:p>
     <w:p>
@@ -2997,6 +2883,78 @@
       </w:r>
       <w:r>
         <w:t xml:space="preserve"> en rouge), et plus de 30 privilèges sensibles signalés. Export CSV par rôle.</w:t>
+      </w:r>
+    </w:p>
+    <w:p>
+      <w:pPr>
+        <w:pStyle w:val="Heading2"/>
+      </w:pPr>
+      <w:r>
+        <w:t xml:space="preserve">Teams</w:t>
+      </w:r>
+    </w:p>
+    <w:p>
+      <w:pPr>
+        <w:spacing w:after="120"/>
+      </w:pPr>
+      <w:r>
+        <w:t xml:space="preserve">Toutes les teams de l'org par type (propriétaires, groupes Entra, access teams chargées à la demande) : les membres, et surtout les </w:t>
+      </w:r>
+      <w:r>
+        <w:rPr>
+          <w:b/>
+          <w:bCs/>
+        </w:rPr>
+        <w:t xml:space="preserve">rôles de sécurité portés par la team</w:t>
+      </w:r>
+      <w:r>
+        <w:t xml:space="preserve"> — hérités par chaque membre sans jamais apparaître sur sa fiche. C'est la réponse à « pourquoi cet utilisateur a-t-il ce droit ? ». Pour les teams Entra : Object ID du groupe copiable, et rappel que la composition se matérialise au prochain accès de l'utilisateur.</w:t>
+      </w:r>
+    </w:p>
+    <w:p>
+      <w:pPr>
+        <w:pStyle w:val="Heading2"/>
+      </w:pPr>
+      <w:r>
+        <w:t xml:space="preserve">Business Units &amp; Adoption</w:t>
+      </w:r>
+    </w:p>
+    <w:p>
+      <w:pPr>
+        <w:spacing w:after="120"/>
+      </w:pPr>
+      <w:r>
+        <w:t xml:space="preserve">Hiérarchie des business units en arbre ou en </w:t>
+      </w:r>
+      <w:r>
+        <w:rPr>
+          <w:b/>
+          <w:bCs/>
+        </w:rPr>
+        <w:t xml:space="preserve">organigramme plein écran</w:t>
+      </w:r>
+      <w:r>
+        <w:t xml:space="preserve"> (export PNG). Déplacement d'utilisateurs en masse — cochez, ou </w:t>
+      </w:r>
+      <w:r>
+        <w:rPr>
+          <w:b/>
+          <w:bCs/>
+        </w:rPr>
+        <w:t xml:space="preserve">collez une liste d'emails</w:t>
+      </w:r>
+      <w:r>
+        <w:t xml:space="preserve"> (sélection dans la BU affichée, ou recherche org entière pour déplacer VERS la BU) — avec la vérité sur les rôles annoncée avant confirmation. </w:t>
+      </w:r>
+      <w:r>
+        <w:rPr>
+          <w:b/>
+          <w:bCs/>
+        </w:rPr>
+        <w:t xml:space="preserve">Adoption</w:t>
+      </w:r>
+      <w:r>
+        <w:t xml:space="preserve"> : événements d'accès, DAU/WAU/MAU, taux par BU, inactivité, rapport PowerPoint en un clic.</w:t>
       </w:r>
     </w:p>
     <w:p>
@@ -3583,7 +3541,7 @@
                 <w:sz w:val="20"/>
                 <w:szCs w:val="20"/>
               </w:rPr>
-              <w:t xml:space="preserve">Le badge vient de l'API OrganizationType. Si l'org est récente, re-cliquez l'icône Colvio depuis l'onglet D365.</w:t>
+              <w:t xml:space="preserve">Le badge mappe l'enum OrganizationType : une prod répond Customer ou Secondary, et toute valeur inconnue est présumée PROD (fail-closed) — un badge PROD « en trop » coûte un clic de confirmation, jamais l'inverse.</w:t>
             </w:r>
           </w:p>
         </w:tc>
@@ -4086,7 +4044,7 @@
         <w:sz w:val="17"/>
         <w:szCs w:val="17"/>
       </w:rPr>
-      <w:t xml:space="preserve">Colvio v1.11.154 — Guide de formation  —  </w:t>
+      <w:t xml:space="preserve">Colvio v1.11.170 — Guide de formation  —  </w:t>
     </w:r>
     <w:r>
       <w:rPr>

</xml_diff>